<commit_message>
main: Added Logistic Regression folder and created a logistic regression model that can predict loan amount can be sanctioned to a person or not
</commit_message>
<xml_diff>
--- a/ML with python - Logistic regression/ML - logistic regression.docx
+++ b/ML with python - Logistic regression/ML - logistic regression.docx
@@ -77,19 +77,7 @@
         <w:rPr>
           <w:lang w:val="en-US"/>
         </w:rPr>
-        <w:t xml:space="preserve">: If we have </w:t>
-      </w:r>
-      <w:r>
-        <w:rPr>
-          <w:lang w:val="en-US"/>
-        </w:rPr>
-        <w:t xml:space="preserve">more than </w:t>
-      </w:r>
-      <w:r>
-        <w:rPr>
-          <w:lang w:val="en-US"/>
-        </w:rPr>
-        <w:t xml:space="preserve">a single </w:t>
+        <w:t xml:space="preserve">: If we have more than a single </w:t>
       </w:r>
       <w:r>
         <w:rPr>
@@ -117,19 +105,7 @@
         <w:rPr>
           <w:lang w:val="en-US"/>
         </w:rPr>
-        <w:t xml:space="preserve"> is Linear then, we can use </w:t>
-      </w:r>
-      <w:r>
-        <w:rPr>
-          <w:lang w:val="en-US"/>
-        </w:rPr>
-        <w:t>multiple</w:t>
-      </w:r>
-      <w:r>
-        <w:rPr>
-          <w:lang w:val="en-US"/>
-        </w:rPr>
-        <w:t xml:space="preserve"> linear regression.</w:t>
+        <w:t xml:space="preserve"> is Linear then, we can use multiple linear regression.</w:t>
       </w:r>
     </w:p>
     <w:p>
@@ -158,13 +134,7 @@
         <w:rPr>
           <w:lang w:val="en-US"/>
         </w:rPr>
-        <w:t xml:space="preserve">: </w:t>
-      </w:r>
-      <w:r>
-        <w:rPr>
-          <w:lang w:val="en-US"/>
-        </w:rPr>
-        <w:t xml:space="preserve"> If the relationship between the </w:t>
+        <w:t xml:space="preserve">:  If the relationship between the </w:t>
       </w:r>
       <w:r>
         <w:rPr>
@@ -192,37 +162,231 @@
         <w:rPr>
           <w:lang w:val="en-US"/>
         </w:rPr>
-        <w:t xml:space="preserve"> is </w:t>
-      </w:r>
-      <w:r>
-        <w:rPr>
-          <w:lang w:val="en-US"/>
-        </w:rPr>
-        <w:t xml:space="preserve">non – </w:t>
-      </w:r>
-      <w:r>
-        <w:rPr>
-          <w:lang w:val="en-US"/>
-        </w:rPr>
-        <w:t>Linear</w:t>
-      </w:r>
-      <w:r>
-        <w:rPr>
-          <w:lang w:val="en-US"/>
-        </w:rPr>
-        <w:t xml:space="preserve"> or log-linear or exponential</w:t>
-      </w:r>
-      <w:r>
-        <w:rPr>
-          <w:lang w:val="en-US"/>
-        </w:rPr>
-        <w:t xml:space="preserve"> then, we can use</w:t>
-      </w:r>
-      <w:r>
-        <w:rPr>
-          <w:lang w:val="en-US"/>
-        </w:rPr>
-        <w:t xml:space="preserve"> poisson regression</w:t>
+        <w:t xml:space="preserve"> is non – Linear or log-linear or exponential then, we can use poisson regression.</w:t>
+      </w:r>
+    </w:p>
+    <w:p>
+      <w:pPr>
+        <w:rPr>
+          <w:lang w:val="en-US"/>
+        </w:rPr>
+      </w:pPr>
+      <w:r>
+        <w:rPr>
+          <w:b/>
+          <w:bCs/>
+          <w:lang w:val="en-US"/>
+        </w:rPr>
+        <w:t>Logistic Regression:</w:t>
+      </w:r>
+      <w:r>
+        <w:rPr>
+          <w:b/>
+          <w:bCs/>
+          <w:lang w:val="en-US"/>
+        </w:rPr>
+        <w:t xml:space="preserve">  </w:t>
+      </w:r>
+      <w:r>
+        <w:t xml:space="preserve">If the relation between the </w:t>
+      </w:r>
+      <w:r>
+        <w:rPr>
+          <w:b/>
+          <w:bCs/>
+          <w:lang w:val="en-US"/>
+        </w:rPr>
+        <w:t>predictor variable X</w:t>
+      </w:r>
+      <w:r>
+        <w:rPr>
+          <w:lang w:val="en-US"/>
+        </w:rPr>
+        <w:t xml:space="preserve"> and </w:t>
+      </w:r>
+      <w:r>
+        <w:rPr>
+          <w:b/>
+          <w:bCs/>
+          <w:lang w:val="en-US"/>
+        </w:rPr>
+        <w:t>response variable Y</w:t>
+      </w:r>
+      <w:r>
+        <w:rPr>
+          <w:lang w:val="en-US"/>
+        </w:rPr>
+        <w:t xml:space="preserve"> is dichotomous or binary, sigmoid curve can be used which of S shape. Then, Logistic regression can be used.</w:t>
+      </w:r>
+    </w:p>
+    <w:p>
+      <w:pPr>
+        <w:rPr>
+          <w:lang w:val="en-US"/>
+        </w:rPr>
+      </w:pPr>
+    </w:p>
+    <w:p>
+      <w:pPr>
+        <w:rPr>
+          <w:b/>
+          <w:bCs/>
+          <w:lang w:val="en-US"/>
+        </w:rPr>
+      </w:pPr>
+      <w:r>
+        <w:rPr>
+          <w:b/>
+          <w:bCs/>
+          <w:lang w:val="en-US"/>
+        </w:rPr>
+        <w:t>Logistic Regression:</w:t>
+      </w:r>
+    </w:p>
+    <w:p>
+      <w:pPr>
+        <w:rPr>
+          <w:lang w:val="en-US"/>
+        </w:rPr>
+      </w:pPr>
+      <w:r>
+        <w:rPr>
+          <w:lang w:val="en-US"/>
+        </w:rPr>
+        <w:t xml:space="preserve">As this is used for the classification problems, the categorical values are converted to </w:t>
+      </w:r>
+      <w:r>
+        <w:rPr>
+          <w:b/>
+          <w:bCs/>
+          <w:lang w:val="en-US"/>
+        </w:rPr>
+        <w:t>0’s and 1’s</w:t>
+      </w:r>
+      <w:r>
+        <w:rPr>
+          <w:lang w:val="en-US"/>
+        </w:rPr>
+        <w:t xml:space="preserve"> that’s the reason it is termed as the logistic regression.</w:t>
+      </w:r>
+    </w:p>
+    <w:p>
+      <w:pPr>
+        <w:rPr>
+          <w:lang w:val="en-US"/>
+        </w:rPr>
+      </w:pPr>
+      <w:r>
+        <w:rPr>
+          <w:lang w:val="en-US"/>
+        </w:rPr>
+        <w:t xml:space="preserve">The Sigmoid curve is formed. Then, the logistic models use a </w:t>
+      </w:r>
+      <w:r>
+        <w:rPr>
+          <w:lang w:val="en-US"/>
+        </w:rPr>
+        <w:t>C</w:t>
+      </w:r>
+      <w:r>
+        <w:rPr>
+          <w:lang w:val="en-US"/>
+        </w:rPr>
+        <w:t xml:space="preserve">riteria called </w:t>
+      </w:r>
+      <w:r>
+        <w:rPr>
+          <w:b/>
+          <w:bCs/>
+          <w:lang w:val="en-US"/>
+        </w:rPr>
+        <w:t>cut off threshold</w:t>
+      </w:r>
+      <w:r>
+        <w:rPr>
+          <w:lang w:val="en-US"/>
+        </w:rPr>
+        <w:t>. If the value is below the cut off threshold it will be considered as no and the values above the cut off threshold will be considered as Yes.</w:t>
+      </w:r>
+    </w:p>
+    <w:p>
+      <w:pPr>
+        <w:rPr>
+          <w:lang w:val="en-US"/>
+        </w:rPr>
+      </w:pPr>
+      <w:r>
+        <w:rPr>
+          <w:lang w:val="en-US"/>
+        </w:rPr>
+        <w:t>Generally, 0.5 will be cutoff for the most of the models, but we can setup the threshold based on the data we have.</w:t>
+      </w:r>
+    </w:p>
+    <w:p>
+      <w:pPr>
+        <w:rPr>
+          <w:lang w:val="en-US"/>
+        </w:rPr>
+      </w:pPr>
+    </w:p>
+    <w:p>
+      <w:pPr>
+        <w:rPr>
+          <w:b/>
+          <w:bCs/>
+          <w:lang w:val="en-US"/>
+        </w:rPr>
+      </w:pPr>
+      <w:r>
+        <w:rPr>
+          <w:b/>
+          <w:bCs/>
+          <w:lang w:val="en-US"/>
+        </w:rPr>
+        <w:t>Types of Logistic Regression:</w:t>
+      </w:r>
+    </w:p>
+    <w:p>
+      <w:pPr>
+        <w:rPr>
+          <w:lang w:val="en-US"/>
+        </w:rPr>
+      </w:pPr>
+      <w:r>
+        <w:rPr>
+          <w:b/>
+          <w:bCs/>
+          <w:lang w:val="en-US"/>
+        </w:rPr>
+        <w:t xml:space="preserve">Binomial: </w:t>
+      </w:r>
+      <w:r>
+        <w:rPr>
+          <w:lang w:val="en-US"/>
+        </w:rPr>
+        <w:t xml:space="preserve">The problems where the response variable will only be </w:t>
+      </w:r>
+      <w:r>
+        <w:rPr>
+          <w:b/>
+          <w:bCs/>
+          <w:lang w:val="en-US"/>
+        </w:rPr>
+        <w:t>Yes or No</w:t>
+      </w:r>
+      <w:r>
+        <w:rPr>
+          <w:lang w:val="en-US"/>
+        </w:rPr>
+        <w:t xml:space="preserve">. </w:t>
+      </w:r>
+      <w:r>
+        <w:rPr>
+          <w:b/>
+          <w:bCs/>
+          <w:lang w:val="en-US"/>
+        </w:rPr>
+        <w:t>True or False</w:t>
       </w:r>
       <w:r>
         <w:rPr>
@@ -230,80 +394,176 @@
         </w:rPr>
         <w:t>.</w:t>
       </w:r>
-    </w:p>
-    <w:p>
-      <w:pPr>
-        <w:rPr>
-          <w:lang w:val="en-US"/>
-        </w:rPr>
-      </w:pPr>
-      <w:r>
-        <w:rPr>
-          <w:b/>
-          <w:bCs/>
-          <w:lang w:val="en-US"/>
-        </w:rPr>
-        <w:t>Logistic Regression:</w:t>
-      </w:r>
-      <w:r>
-        <w:rPr>
-          <w:b/>
-          <w:bCs/>
-          <w:lang w:val="en-US"/>
-        </w:rPr>
-        <w:t xml:space="preserve">  </w:t>
-      </w:r>
-      <w:r>
-        <w:t xml:space="preserve">If the relation between the </w:t>
-      </w:r>
-      <w:r>
-        <w:rPr>
-          <w:b/>
-          <w:bCs/>
-          <w:lang w:val="en-US"/>
-        </w:rPr>
-        <w:t>predictor variable X</w:t>
-      </w:r>
-      <w:r>
-        <w:rPr>
-          <w:lang w:val="en-US"/>
-        </w:rPr>
-        <w:t xml:space="preserve"> and </w:t>
-      </w:r>
-      <w:r>
-        <w:rPr>
-          <w:b/>
-          <w:bCs/>
-          <w:lang w:val="en-US"/>
-        </w:rPr>
-        <w:t>response variable Y</w:t>
-      </w:r>
-      <w:r>
-        <w:rPr>
-          <w:lang w:val="en-US"/>
-        </w:rPr>
-        <w:t xml:space="preserve"> is</w:t>
-      </w:r>
-      <w:r>
-        <w:rPr>
-          <w:lang w:val="en-US"/>
-        </w:rPr>
-        <w:t xml:space="preserve"> dichotomous or binary, sigmoid curve can be used which of S shape. Then, Logistic regression can be used.</w:t>
-      </w:r>
-    </w:p>
-    <w:p>
-      <w:pPr>
-        <w:rPr>
-          <w:lang w:val="en-US"/>
-        </w:rPr>
-      </w:pPr>
-    </w:p>
-    <w:p>
-      <w:pPr>
-        <w:rPr>
-          <w:lang w:val="en-US"/>
-        </w:rPr>
-      </w:pPr>
+      <w:r>
+        <w:rPr>
+          <w:lang w:val="en-US"/>
+        </w:rPr>
+        <w:t xml:space="preserve"> </w:t>
+      </w:r>
+      <w:r>
+        <w:rPr>
+          <w:b/>
+          <w:bCs/>
+          <w:lang w:val="en-US"/>
+        </w:rPr>
+        <w:t xml:space="preserve">0 </w:t>
+      </w:r>
+      <w:r>
+        <w:rPr>
+          <w:b/>
+          <w:bCs/>
+          <w:lang w:val="en-US"/>
+        </w:rPr>
+        <w:t>or</w:t>
+      </w:r>
+      <w:r>
+        <w:rPr>
+          <w:b/>
+          <w:bCs/>
+          <w:lang w:val="en-US"/>
+        </w:rPr>
+        <w:t xml:space="preserve"> 1</w:t>
+      </w:r>
+      <w:r>
+        <w:rPr>
+          <w:lang w:val="en-US"/>
+        </w:rPr>
+        <w:t>.</w:t>
+      </w:r>
+    </w:p>
+    <w:p>
+      <w:pPr>
+        <w:rPr>
+          <w:lang w:val="en-US"/>
+        </w:rPr>
+      </w:pPr>
+      <w:r>
+        <w:rPr>
+          <w:b/>
+          <w:bCs/>
+          <w:lang w:val="en-US"/>
+        </w:rPr>
+        <w:t xml:space="preserve">Multinomial: </w:t>
+      </w:r>
+      <w:r>
+        <w:rPr>
+          <w:lang w:val="en-US"/>
+        </w:rPr>
+        <w:t>The problems where the response variable has more than 3 options.</w:t>
+      </w:r>
+    </w:p>
+    <w:p>
+      <w:pPr>
+        <w:rPr>
+          <w:b/>
+          <w:bCs/>
+          <w:lang w:val="en-US"/>
+        </w:rPr>
+      </w:pPr>
+      <w:r>
+        <w:rPr>
+          <w:lang w:val="en-US"/>
+        </w:rPr>
+        <w:tab/>
+      </w:r>
+      <w:r>
+        <w:rPr>
+          <w:lang w:val="en-US"/>
+        </w:rPr>
+        <w:tab/>
+      </w:r>
+      <w:r>
+        <w:rPr>
+          <w:b/>
+          <w:bCs/>
+          <w:lang w:val="en-US"/>
+        </w:rPr>
+        <w:t>Ex: Prediction of highest risk of medical condition of a patient from the 3 medical conditions.</w:t>
+      </w:r>
+    </w:p>
+    <w:p>
+      <w:pPr>
+        <w:rPr>
+          <w:lang w:val="en-US"/>
+        </w:rPr>
+      </w:pPr>
+      <w:r>
+        <w:rPr>
+          <w:b/>
+          <w:bCs/>
+          <w:lang w:val="en-US"/>
+        </w:rPr>
+        <w:t>Ordered:</w:t>
+      </w:r>
+      <w:r>
+        <w:rPr>
+          <w:b/>
+          <w:bCs/>
+          <w:lang w:val="en-US"/>
+        </w:rPr>
+        <w:t xml:space="preserve"> </w:t>
+      </w:r>
+      <w:r>
+        <w:rPr>
+          <w:lang w:val="en-US"/>
+        </w:rPr>
+        <w:t>The ordered regression is similar to multinomial with a key difference like rating a course on linked</w:t>
+      </w:r>
+      <w:r>
+        <w:rPr>
+          <w:lang w:val="en-US"/>
+        </w:rPr>
+        <w:t>I</w:t>
+      </w:r>
+      <w:r>
+        <w:rPr>
+          <w:lang w:val="en-US"/>
+        </w:rPr>
+        <w:t>n based on the coding examples shown</w:t>
+      </w:r>
+      <w:r>
+        <w:rPr>
+          <w:lang w:val="en-US"/>
+        </w:rPr>
+        <w:t>.</w:t>
+      </w:r>
+    </w:p>
+    <w:p>
+      <w:pPr>
+        <w:rPr>
+          <w:lang w:val="en-US"/>
+        </w:rPr>
+      </w:pPr>
+    </w:p>
+    <w:p>
+      <w:pPr>
+        <w:rPr>
+          <w:b/>
+          <w:bCs/>
+          <w:lang w:val="en-US"/>
+        </w:rPr>
+      </w:pPr>
+      <w:r>
+        <w:rPr>
+          <w:b/>
+          <w:bCs/>
+          <w:lang w:val="en-US"/>
+        </w:rPr>
+        <w:t>Inference in Logistic Regression:</w:t>
+      </w:r>
+    </w:p>
+    <w:p>
+      <w:pPr>
+        <w:rPr>
+          <w:lang w:val="en-US"/>
+        </w:rPr>
+      </w:pPr>
+      <w:r>
+        <w:rPr>
+          <w:lang w:val="en-US"/>
+        </w:rPr>
+        <w:t>Sometimes, we want to study, what value of x dependent variable has an impact on the Response variable Y. That exact analogy is called inference</w:t>
+      </w:r>
     </w:p>
     <w:sectPr>
       <w:pgSz w:w="11906" w:h="16838"/>
@@ -719,6 +979,7 @@
   <w:style w:type="character" w:default="1" w:styleId="DefaultParagraphFont">
     <w:name w:val="Default Paragraph Font"/>
     <w:uiPriority w:val="1"/>
+    <w:semiHidden/>
     <w:unhideWhenUsed/>
   </w:style>
   <w:style w:type="table" w:default="1" w:styleId="TableNormal">

</xml_diff>